<commit_message>
Client doc: add the offline-queue and truck-log timezone fixes
Both are things the crew would have felt in week one, so they belong in the
list the client reads before the 2nd.

Co-Authored-By: Claude Opus 5 <noreply@anthropic.com>
</commit_message>
<xml_diff>
--- a/Warehouse Wizard - Launch Readiness (Sept 24).docx
+++ b/Warehouse Wizard - Launch Readiness (Sept 24).docx
@@ -397,6 +397,50 @@
           <w:sz w:val="22"/>
         </w:rPr>
         <w:t>A single submission could deduct the same material from stock more than once.</w:t>
+      </w:r>
+    </w:p>
+    <w:p>
+      <w:pPr>
+        <w:pStyle w:val="ListBullet"/>
+        <w:spacing w:after="100"/>
+      </w:pPr>
+      <w:r>
+        <w:rPr>
+          <w:b/>
+          <w:color w:val="15212A"/>
+          <w:sz w:val="22"/>
+        </w:rPr>
+        <w:t xml:space="preserve">Work logged with no signal is no longer lost. </w:t>
+      </w:r>
+      <w:r>
+        <w:rPr>
+          <w:b w:val="0"/>
+          <w:color w:val="15212A"/>
+          <w:sz w:val="22"/>
+        </w:rPr>
+        <w:t>If someone logged materials out of coverage, the app said it would sync later — but closing the app, or even just it refreshing in the background, threw that away. It’s now written to the phone and sent when signal returns. Worth knowing for the first week, since that one would have hit the crew hardest.</w:t>
+      </w:r>
+    </w:p>
+    <w:p>
+      <w:pPr>
+        <w:pStyle w:val="ListBullet"/>
+        <w:spacing w:after="100"/>
+      </w:pPr>
+      <w:r>
+        <w:rPr>
+          <w:b/>
+          <w:color w:val="15212A"/>
+          <w:sz w:val="22"/>
+        </w:rPr>
+        <w:t xml:space="preserve">End-of-day truck logs now tick off the right day. </w:t>
+      </w:r>
+      <w:r>
+        <w:rPr>
+          <w:b w:val="0"/>
+          <w:color w:val="15212A"/>
+          <w:sz w:val="22"/>
+        </w:rPr>
+        <w:t>A log submitted after 5pm was being filed against the next day, so the tasks it covers still looked outstanding and the daily completion points didn’t land.</w:t>
       </w:r>
     </w:p>
     <w:p>

</xml_diff>